<commit_message>
Updated README and requirements
</commit_message>
<xml_diff>
--- a/FAI-FinalReport.docx
+++ b/FAI-FinalReport.docx
@@ -219,8 +219,22 @@
           <w:lang w:eastAsia="en-GB"/>
           <w14:ligatures w14:val="none"/>
         </w:rPr>
-        <w:t> https://github.com/TheSalmanShariff/speech-emotion-recognition</w:t>
-      </w:r>
+        <w:t> </w:t>
+      </w:r>
+      <w:hyperlink r:id="rId5" w:history="1">
+        <w:r>
+          <w:rPr>
+            <w:rStyle w:val="Hyperlink"/>
+            <w:rFonts w:ascii="Times New Roman" w:eastAsia="Times New Roman" w:hAnsi="Times New Roman" w:cs="Times New Roman"/>
+            <w:kern w:val="0"/>
+            <w:sz w:val="28"/>
+            <w:szCs w:val="28"/>
+            <w:lang w:eastAsia="en-GB"/>
+            <w14:ligatures w14:val="none"/>
+          </w:rPr>
+          <w:t>https://github.com/TheSalmanShariff/speech-emotion-recognition</w:t>
+        </w:r>
+      </w:hyperlink>
     </w:p>
     <w:p>
       <w:pPr>
@@ -832,7 +846,7 @@
                     <pic:cNvPicPr/>
                   </pic:nvPicPr>
                   <pic:blipFill>
-                    <a:blip r:embed="rId5" cstate="print">
+                    <a:blip r:embed="rId6" cstate="print">
                       <a:extLst>
                         <a:ext uri="{28A0092B-C50C-407E-A947-70E740481C1C}">
                           <a14:useLocalDpi xmlns:a14="http://schemas.microsoft.com/office/drawing/2010/main" val="0"/>
@@ -2927,7 +2941,7 @@
                     <pic:cNvPicPr/>
                   </pic:nvPicPr>
                   <pic:blipFill>
-                    <a:blip r:embed="rId6" cstate="print">
+                    <a:blip r:embed="rId7" cstate="print">
                       <a:extLst>
                         <a:ext uri="{28A0092B-C50C-407E-A947-70E740481C1C}">
                           <a14:useLocalDpi xmlns:a14="http://schemas.microsoft.com/office/drawing/2010/main" val="0"/>
@@ -3159,7 +3173,7 @@
                     <pic:cNvPicPr/>
                   </pic:nvPicPr>
                   <pic:blipFill>
-                    <a:blip r:embed="rId7" cstate="print">
+                    <a:blip r:embed="rId8" cstate="print">
                       <a:extLst>
                         <a:ext uri="{28A0092B-C50C-407E-A947-70E740481C1C}">
                           <a14:useLocalDpi xmlns:a14="http://schemas.microsoft.com/office/drawing/2010/main" val="0"/>
@@ -3403,7 +3417,7 @@
                     <pic:cNvPicPr/>
                   </pic:nvPicPr>
                   <pic:blipFill>
-                    <a:blip r:embed="rId8" cstate="print">
+                    <a:blip r:embed="rId9" cstate="print">
                       <a:extLst>
                         <a:ext uri="{28A0092B-C50C-407E-A947-70E740481C1C}">
                           <a14:useLocalDpi xmlns:a14="http://schemas.microsoft.com/office/drawing/2010/main" val="0"/>
@@ -3467,7 +3481,7 @@
                     <pic:cNvPicPr/>
                   </pic:nvPicPr>
                   <pic:blipFill>
-                    <a:blip r:embed="rId9" cstate="print">
+                    <a:blip r:embed="rId10" cstate="print">
                       <a:extLst>
                         <a:ext uri="{28A0092B-C50C-407E-A947-70E740481C1C}">
                           <a14:useLocalDpi xmlns:a14="http://schemas.microsoft.com/office/drawing/2010/main" val="0"/>
@@ -4301,7 +4315,7 @@
                     <pic:cNvPicPr/>
                   </pic:nvPicPr>
                   <pic:blipFill>
-                    <a:blip r:embed="rId10" cstate="print">
+                    <a:blip r:embed="rId11" cstate="print">
                       <a:extLst>
                         <a:ext uri="{28A0092B-C50C-407E-A947-70E740481C1C}">
                           <a14:useLocalDpi xmlns:a14="http://schemas.microsoft.com/office/drawing/2010/main" val="0"/>
@@ -6248,7 +6262,7 @@
                     <pic:cNvPicPr/>
                   </pic:nvPicPr>
                   <pic:blipFill>
-                    <a:blip r:embed="rId11"/>
+                    <a:blip r:embed="rId12"/>
                     <a:stretch>
                       <a:fillRect/>
                     </a:stretch>
@@ -8521,7 +8535,6 @@
     <w:name w:val="Hyperlink"/>
     <w:basedOn w:val="DefaultParagraphFont"/>
     <w:uiPriority w:val="99"/>
-    <w:semiHidden/>
     <w:unhideWhenUsed/>
     <w:rsid w:val="00AA3549"/>
     <w:rPr>
@@ -8547,6 +8560,18 @@
         <w:insideV w:val="single" w:sz="4" w:space="0" w:color="auto"/>
       </w:tblBorders>
     </w:tblPr>
+  </w:style>
+  <w:style w:type="character" w:styleId="UnresolvedMention">
+    <w:name w:val="Unresolved Mention"/>
+    <w:basedOn w:val="DefaultParagraphFont"/>
+    <w:uiPriority w:val="99"/>
+    <w:semiHidden/>
+    <w:unhideWhenUsed/>
+    <w:rsid w:val="00625736"/>
+    <w:rPr>
+      <w:color w:val="605E5C"/>
+      <w:shd w:val="clear" w:color="auto" w:fill="E1DFDD"/>
+    </w:rPr>
   </w:style>
 </w:styles>
 </file>

</xml_diff>